<commit_message>
feat: tambah kelola partisipan, opsi PJ rundown, filter & officer per peran
- Modal "Tambah Partisipan/Opsi PJ" (pilih peserta existing / buat baru,
  termasuk buat ParticipantType baru via opsi "Lainnya")
- Edit & hapus peserta per baris di tabel (modal + konfirmasi), reaktif
- Import partisipan & draft cost dari Excel kini MERGE (tidak menimpa)
- Field "Peran Kepanitiaan" + penanda ketua pelaksana (is_signer_commitee)
- Validasi submit: tolak bila ketua pelaksana belum ditentukan
- Rundown: kolom officer per peran (officer_text) di-render jadi 1 variabel
  rd_officer_list dgn style WordML (Arial MT, judul 9pt bold, list 8pt)
- Tabel peserta "others" (peran selain 4 utama) + pesan kosong di tabel
- Filter tahun (default tahun ini) & pilihan jumlah data di list pengajuan & LPJ
- Update template docx (tor, draft_tor, jadwal_kegiatan) untuk rd_officer_list
- Hapus file lock docx (~$poran_kegiatan.docx)
</commit_message>
<xml_diff>
--- a/public/templates/draft_tor.docx
+++ b/public/templates/draft_tor.docx
@@ -183,7 +183,7 @@
           </mc:Choice>
           <mc:Fallback>
             <w:pict>
-              <v:group w14:anchorId="6E8FAB53" id="Group 1" o:spid="_x0000_s1026" style="position:absolute;margin-left:56.7pt;margin-top:56.7pt;width:481.9pt;height:722.9pt;z-index:-17074176;mso-wrap-distance-left:0;mso-wrap-distance-right:0;mso-position-horizontal-relative:page;mso-position-vertical-relative:page" coordsize="61201,91808" o:gfxdata="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">
+              <v:group w14:anchorId="35D826EF" id="Group 1" o:spid="_x0000_s1026" style="position:absolute;margin-left:56.7pt;margin-top:56.7pt;width:481.9pt;height:722.9pt;z-index:-17074176;mso-wrap-distance-left:0;mso-wrap-distance-right:0;mso-position-horizontal-relative:page;mso-position-vertical-relative:page" coordsize="61201,91808" o:gfxdata="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">
                 <v:shape id="Graphic 2" o:spid="_x0000_s1027" style="position:absolute;width:61201;height:91808;visibility:visible;mso-wrap-style:square;v-text-anchor:top" coordsize="6120130,9180830" o:gfxdata="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" path="m6107354,12700r-6350,l6101004,19050r,9142501l19050,9161551r,-9142501l6101004,19050r,-6350l12700,12700r,9155201l6107354,9167901r,-9155201xem6120054,r-6350,l6113704,6350r,9167901l6350,9174251,6350,6350r6107354,l6113704,,,,,9180601r6120054,l6120054,xe" fillcolor="black" stroked="f">
                   <v:path arrowok="t"/>
                 </v:shape>
@@ -3098,16 +3098,7 @@
                 <w:b/>
                 <w:sz w:val="18"/>
               </w:rPr>
-              <w:t xml:space="preserve">Narasumber &amp; </w:t>
-            </w:r>
-            <w:r>
-              <w:rPr>
-                <w:rFonts w:ascii="Arial"/>
-                <w:b/>
-                <w:spacing w:val="-2"/>
-                <w:sz w:val="18"/>
-              </w:rPr>
-              <w:t>Moderator</w:t>
+              <w:t xml:space="preserve">        Petugas Acara</w:t>
             </w:r>
           </w:p>
         </w:tc>
@@ -3232,129 +3223,30 @@
               <w:spacing w:before="0"/>
               <w:rPr>
                 <w:rFonts w:ascii="Times New Roman"/>
-                <w:b/>
-                <w:bCs/>
                 <w:sz w:val="18"/>
               </w:rPr>
             </w:pPr>
             <w:r>
               <w:rPr>
                 <w:rFonts w:ascii="Times New Roman"/>
-                <w:b/>
-                <w:bCs/>
-                <w:sz w:val="18"/>
-              </w:rPr>
-              <w:t>${rd_speaker_label}</w:t>
-            </w:r>
-          </w:p>
-          <w:p>
-            <w:pPr>
-              <w:pStyle w:val="TableParagraph"/>
-              <w:spacing w:before="0"/>
+                <w:sz w:val="18"/>
+              </w:rPr>
+              <w:t>${</w:t>
+            </w:r>
+            <w:r>
               <w:rPr>
                 <w:rFonts w:ascii="Times New Roman"/>
                 <w:sz w:val="18"/>
               </w:rPr>
-            </w:pPr>
+              <w:t>rd_officer_list</w:t>
+            </w:r>
             <w:r>
               <w:rPr>
                 <w:rFonts w:ascii="Times New Roman"/>
                 <w:sz w:val="18"/>
               </w:rPr>
-              <w:t>${</w:t>
-            </w:r>
-            <w:r>
-              <w:rPr>
-                <w:rFonts w:ascii="Times New Roman"/>
-                <w:sz w:val="18"/>
-              </w:rPr>
-              <w:t>rd_speaker_list</w:t>
-            </w:r>
-            <w:r>
-              <w:rPr>
-                <w:rFonts w:ascii="Times New Roman"/>
-                <w:sz w:val="18"/>
-              </w:rPr>
               <w:t>}</w:t>
             </w:r>
-          </w:p>
-          <w:p>
-            <w:pPr>
-              <w:pStyle w:val="TableParagraph"/>
-              <w:spacing w:before="0"/>
-              <w:rPr>
-                <w:rFonts w:ascii="Times New Roman"/>
-                <w:b/>
-                <w:bCs/>
-                <w:sz w:val="18"/>
-              </w:rPr>
-            </w:pPr>
-          </w:p>
-          <w:p>
-            <w:pPr>
-              <w:pStyle w:val="TableParagraph"/>
-              <w:spacing w:before="0"/>
-              <w:rPr>
-                <w:rFonts w:ascii="Times New Roman"/>
-                <w:b/>
-                <w:bCs/>
-                <w:sz w:val="18"/>
-              </w:rPr>
-            </w:pPr>
-            <w:r>
-              <w:rPr>
-                <w:rFonts w:ascii="Times New Roman"/>
-                <w:b/>
-                <w:bCs/>
-                <w:sz w:val="18"/>
-              </w:rPr>
-              <w:t>${rd_</w:t>
-            </w:r>
-            <w:r>
-              <w:rPr>
-                <w:rFonts w:ascii="Times New Roman"/>
-                <w:b/>
-                <w:bCs/>
-                <w:sz w:val="18"/>
-              </w:rPr>
-              <w:t>moderator</w:t>
-            </w:r>
-            <w:r>
-              <w:rPr>
-                <w:rFonts w:ascii="Times New Roman"/>
-                <w:b/>
-                <w:bCs/>
-                <w:sz w:val="18"/>
-              </w:rPr>
-              <w:t>_label}</w:t>
-            </w:r>
-          </w:p>
-          <w:p>
-            <w:pPr>
-              <w:pStyle w:val="TableParagraph"/>
-              <w:spacing w:before="0"/>
-              <w:rPr>
-                <w:rFonts w:ascii="Times New Roman"/>
-                <w:sz w:val="18"/>
-              </w:rPr>
-            </w:pPr>
-            <w:r>
-              <w:rPr>
-                <w:rFonts w:ascii="Times New Roman"/>
-                <w:sz w:val="18"/>
-              </w:rPr>
-              <w:t>${rd_moderator_list}</w:t>
-            </w:r>
-          </w:p>
-          <w:p>
-            <w:pPr>
-              <w:pStyle w:val="TableParagraph"/>
-              <w:spacing w:before="0"/>
-              <w:rPr>
-                <w:rFonts w:ascii="Times New Roman"/>
-                <w:sz w:val="18"/>
-              </w:rPr>
-            </w:pPr>
           </w:p>
         </w:tc>
       </w:tr>
@@ -4072,7 +3964,6 @@
               <w:rPr>
                 <w:spacing w:val="-10"/>
               </w:rPr>
-              <w:lastRenderedPageBreak/>
               <w:t>${moderator_no}</w:t>
             </w:r>
           </w:p>
@@ -4134,6 +4025,7 @@
           <w:b/>
           <w:spacing w:val="-2"/>
         </w:rPr>
+        <w:lastRenderedPageBreak/>
         <w:t>Peserta</w:t>
       </w:r>
     </w:p>

</xml_diff>